<commit_message>
Added Tableau PNG File and modified doc and twb file
</commit_message>
<xml_diff>
--- a/TableauProject_of_CovidData.docx
+++ b/TableauProject_of_CovidData.docx
@@ -109,25 +109,20 @@
         </w:rPr>
         <w:t xml:space="preserve"> </w:t>
       </w:r>
-      <w:r>
-        <w:rPr>
-          <w:b/>
-          <w:bCs/>
-          <w:sz w:val="24"/>
-          <w:szCs w:val="24"/>
-        </w:rPr>
-        <w:t>sunitahsharma2021</w:t>
-      </w:r>
-      <w:r>
-        <w:rPr>
-          <w:b/>
-          <w:bCs/>
-          <w:sz w:val="24"/>
-          <w:szCs w:val="24"/>
-        </w:rPr>
-        <w:t>@gmail.com</w:t>
-      </w:r>
-    </w:p>
+      <w:hyperlink r:id="rId7" w:history="1">
+        <w:r>
+          <w:rPr>
+            <w:rStyle w:val="Hyperlink"/>
+            <w:b/>
+            <w:bCs/>
+            <w:sz w:val="24"/>
+            <w:szCs w:val="24"/>
+          </w:rPr>
+          <w:t>sunitahsharma2021@gmail.com</w:t>
+        </w:r>
+      </w:hyperlink>
+    </w:p>
+    <w:p/>
     <w:p>
       <w:pPr>
         <w:pStyle w:val="Title"/>
@@ -238,7 +233,7 @@
                     <pic:cNvPicPr/>
                   </pic:nvPicPr>
                   <pic:blipFill>
-                    <a:blip r:embed="rId7">
+                    <a:blip r:embed="rId8">
                       <a:extLst>
                         <a:ext uri="{28A0092B-C50C-407E-A947-70E740481C1C}">
                           <a14:useLocalDpi xmlns:a14="http://schemas.microsoft.com/office/drawing/2010/main" val="0"/>
@@ -391,7 +386,7 @@
           <w:sz w:val="28"/>
           <w:szCs w:val="28"/>
         </w:rPr>
-        <w:t xml:space="preserve">The Covid-19 pandemic has had a profound impact across the globe, with countries experiencing varying levels of cases, recoveries, and fatalities. This project analyzes worldwide Covid data to uncover meaningful insights into the spread and management of the virus. By examining country-wise statistics, the study aims to highlight global trends, compare national responses, and provide a clear picture of how different regions were affected. The analysis is supported by </w:t>
+        <w:t xml:space="preserve">The Covid-19 pandemic has had a profound impact across the globe, with countries experiencing varying levels of cases, recoveries, and fatalities. This project analyzes worldwide Covid data to uncover meaningful insights into the spread and management of the virus. By examining country-wise statistics, the study aims to highlight global trends, compare national responses, and provide a </w:t>
       </w:r>
       <w:r>
         <w:rPr>
@@ -399,7 +394,7 @@
           <w:szCs w:val="28"/>
         </w:rPr>
         <w:lastRenderedPageBreak/>
-        <w:t>visual dashboards and comparative metrics to make the findings accessible and actionable.</w:t>
+        <w:t>clear picture of how different regions were affected. The analysis is supported by visual dashboards and comparative metrics to make the findings accessible and actionable.</w:t>
       </w:r>
     </w:p>
     <w:p>
@@ -477,7 +472,7 @@
                     <pic:cNvPicPr/>
                   </pic:nvPicPr>
                   <pic:blipFill>
-                    <a:blip r:embed="rId8"/>
+                    <a:blip r:embed="rId9"/>
                     <a:stretch>
                       <a:fillRect/>
                     </a:stretch>
@@ -535,7 +530,7 @@
                     <pic:cNvPicPr/>
                   </pic:nvPicPr>
                   <pic:blipFill>
-                    <a:blip r:embed="rId9"/>
+                    <a:blip r:embed="rId10"/>
                     <a:stretch>
                       <a:fillRect/>
                     </a:stretch>
@@ -609,7 +604,7 @@
                     <pic:cNvPicPr/>
                   </pic:nvPicPr>
                   <pic:blipFill>
-                    <a:blip r:embed="rId10"/>
+                    <a:blip r:embed="rId11"/>
                     <a:stretch>
                       <a:fillRect/>
                     </a:stretch>
@@ -705,7 +700,7 @@
                     <pic:cNvPicPr/>
                   </pic:nvPicPr>
                   <pic:blipFill>
-                    <a:blip r:embed="rId11"/>
+                    <a:blip r:embed="rId12"/>
                     <a:stretch>
                       <a:fillRect/>
                     </a:stretch>
@@ -763,7 +758,7 @@
                     <pic:cNvPicPr/>
                   </pic:nvPicPr>
                   <pic:blipFill>
-                    <a:blip r:embed="rId12"/>
+                    <a:blip r:embed="rId13"/>
                     <a:stretch>
                       <a:fillRect/>
                     </a:stretch>
@@ -822,7 +817,7 @@
                     <pic:cNvPicPr/>
                   </pic:nvPicPr>
                   <pic:blipFill>
-                    <a:blip r:embed="rId13"/>
+                    <a:blip r:embed="rId14"/>
                     <a:stretch>
                       <a:fillRect/>
                     </a:stretch>
@@ -878,7 +873,7 @@
                     <pic:cNvPicPr/>
                   </pic:nvPicPr>
                   <pic:blipFill>
-                    <a:blip r:embed="rId14"/>
+                    <a:blip r:embed="rId15"/>
                     <a:stretch>
                       <a:fillRect/>
                     </a:stretch>
@@ -935,7 +930,7 @@
                     <pic:cNvPicPr/>
                   </pic:nvPicPr>
                   <pic:blipFill>
-                    <a:blip r:embed="rId15"/>
+                    <a:blip r:embed="rId16"/>
                     <a:stretch>
                       <a:fillRect/>
                     </a:stretch>
@@ -991,7 +986,7 @@
                     <pic:cNvPicPr/>
                   </pic:nvPicPr>
                   <pic:blipFill>
-                    <a:blip r:embed="rId16"/>
+                    <a:blip r:embed="rId17"/>
                     <a:stretch>
                       <a:fillRect/>
                     </a:stretch>
@@ -1015,62 +1010,30 @@
     <w:p/>
     <w:p/>
     <w:p/>
-    <w:p>
-      <w:pPr>
-        <w:pBdr>
-          <w:bottom w:val="single" w:sz="6" w:space="1" w:color="auto"/>
-        </w:pBdr>
-        <w:rPr>
-          <w:color w:val="EE0000"/>
-          <w:sz w:val="36"/>
-          <w:szCs w:val="36"/>
-        </w:rPr>
-      </w:pPr>
-    </w:p>
-    <w:p>
-      <w:pPr>
-        <w:pBdr>
-          <w:bottom w:val="single" w:sz="6" w:space="1" w:color="auto"/>
-        </w:pBdr>
-        <w:rPr>
-          <w:color w:val="EE0000"/>
-          <w:sz w:val="36"/>
-          <w:szCs w:val="36"/>
-        </w:rPr>
-      </w:pPr>
-      <w:r>
-        <w:rPr>
-          <w:color w:val="EE0000"/>
-          <w:sz w:val="36"/>
-          <w:szCs w:val="36"/>
-        </w:rPr>
-        <w:lastRenderedPageBreak/>
-        <w:t>Dashboard</w:t>
-      </w:r>
-    </w:p>
-    <w:p>
-      <w:pPr>
-        <w:pBdr>
-          <w:bottom w:val="single" w:sz="6" w:space="1" w:color="auto"/>
-        </w:pBdr>
-        <w:rPr>
-          <w:color w:val="EE0000"/>
-          <w:sz w:val="36"/>
-          <w:szCs w:val="36"/>
-        </w:rPr>
-      </w:pPr>
-    </w:p>
-    <w:p/>
-    <w:p>
-      <w:r>
-        <w:rPr>
-          <w:noProof/>
-        </w:rPr>
+    <w:p/>
+    <w:p/>
+    <w:p/>
+    <w:p/>
+    <w:p/>
+    <w:p>
+      <w:r>
+        <w:t>10</w:t>
+      </w:r>
+      <w:r>
+        <w:t xml:space="preserve">) </w:t>
+      </w:r>
+      <w:r>
+        <w:t>Avg Death Case out of 100</w:t>
+      </w:r>
+      <w:r>
+        <w:t xml:space="preserve"> </w:t>
+      </w:r>
+      <w:r>
         <w:drawing>
-          <wp:inline distT="0" distB="0" distL="0" distR="0" wp14:anchorId="751861E5" wp14:editId="25618D97">
-            <wp:extent cx="6332220" cy="5090160"/>
-            <wp:effectExtent l="0" t="0" r="0" b="0"/>
-            <wp:docPr id="1967997508" name="Picture 1"/>
+          <wp:inline distT="0" distB="0" distL="0" distR="0" wp14:anchorId="31F113A0" wp14:editId="56E55248">
+            <wp:extent cx="5943600" cy="5120640"/>
+            <wp:effectExtent l="0" t="0" r="0" b="3810"/>
+            <wp:docPr id="567202200" name="Picture 1"/>
             <wp:cNvGraphicFramePr>
               <a:graphicFrameLocks xmlns:a="http://schemas.openxmlformats.org/drawingml/2006/main" noChangeAspect="1"/>
             </wp:cNvGraphicFramePr>
@@ -1078,11 +1041,11 @@
               <a:graphicData uri="http://schemas.openxmlformats.org/drawingml/2006/picture">
                 <pic:pic xmlns:pic="http://schemas.openxmlformats.org/drawingml/2006/picture">
                   <pic:nvPicPr>
-                    <pic:cNvPr id="1967997508" name=""/>
+                    <pic:cNvPr id="567202200" name=""/>
                     <pic:cNvPicPr/>
                   </pic:nvPicPr>
                   <pic:blipFill>
-                    <a:blip r:embed="rId17"/>
+                    <a:blip r:embed="rId18"/>
                     <a:stretch>
                       <a:fillRect/>
                     </a:stretch>
@@ -1090,7 +1053,7 @@
                   <pic:spPr>
                     <a:xfrm>
                       <a:off x="0" y="0"/>
-                      <a:ext cx="6332220" cy="5090160"/>
+                      <a:ext cx="5943600" cy="5120640"/>
                     </a:xfrm>
                     <a:prstGeom prst="rect">
                       <a:avLst/>
@@ -1103,6 +1066,407 @@
         </w:drawing>
       </w:r>
     </w:p>
+    <w:p/>
+    <w:p/>
+    <w:p/>
+    <w:p>
+      <w:pPr>
+        <w:pBdr>
+          <w:bottom w:val="single" w:sz="6" w:space="1" w:color="auto"/>
+        </w:pBdr>
+        <w:rPr>
+          <w:color w:val="EE0000"/>
+          <w:sz w:val="36"/>
+          <w:szCs w:val="36"/>
+        </w:rPr>
+      </w:pPr>
+    </w:p>
+    <w:p>
+      <w:pPr>
+        <w:pBdr>
+          <w:bottom w:val="single" w:sz="6" w:space="1" w:color="auto"/>
+        </w:pBdr>
+        <w:rPr>
+          <w:color w:val="EE0000"/>
+          <w:sz w:val="36"/>
+          <w:szCs w:val="36"/>
+        </w:rPr>
+      </w:pPr>
+    </w:p>
+    <w:p>
+      <w:pPr>
+        <w:pBdr>
+          <w:bottom w:val="single" w:sz="6" w:space="1" w:color="auto"/>
+        </w:pBdr>
+        <w:rPr>
+          <w:color w:val="EE0000"/>
+          <w:sz w:val="36"/>
+          <w:szCs w:val="36"/>
+        </w:rPr>
+      </w:pPr>
+    </w:p>
+    <w:p>
+      <w:pPr>
+        <w:pBdr>
+          <w:bottom w:val="single" w:sz="6" w:space="1" w:color="auto"/>
+        </w:pBdr>
+        <w:rPr>
+          <w:color w:val="EE0000"/>
+          <w:sz w:val="36"/>
+          <w:szCs w:val="36"/>
+        </w:rPr>
+      </w:pPr>
+    </w:p>
+    <w:p>
+      <w:pPr>
+        <w:pBdr>
+          <w:bottom w:val="single" w:sz="6" w:space="1" w:color="auto"/>
+        </w:pBdr>
+      </w:pPr>
+      <w:r>
+        <w:t>1</w:t>
+      </w:r>
+      <w:r>
+        <w:t>1</w:t>
+      </w:r>
+      <w:r>
+        <w:t xml:space="preserve">) </w:t>
+      </w:r>
+      <w:r>
+        <w:t xml:space="preserve">Avg </w:t>
+      </w:r>
+      <w:r>
+        <w:t>Recovered</w:t>
+      </w:r>
+      <w:r>
+        <w:t xml:space="preserve"> Case out of 100</w:t>
+      </w:r>
+    </w:p>
+    <w:p>
+      <w:pPr>
+        <w:pBdr>
+          <w:bottom w:val="single" w:sz="6" w:space="1" w:color="auto"/>
+        </w:pBdr>
+        <w:rPr>
+          <w:color w:val="EE0000"/>
+          <w:sz w:val="36"/>
+          <w:szCs w:val="36"/>
+        </w:rPr>
+      </w:pPr>
+      <w:r>
+        <w:rPr>
+          <w:color w:val="EE0000"/>
+          <w:sz w:val="36"/>
+          <w:szCs w:val="36"/>
+        </w:rPr>
+        <w:drawing>
+          <wp:inline distT="0" distB="0" distL="0" distR="0" wp14:anchorId="5A7552D0" wp14:editId="42647BA8">
+            <wp:extent cx="5943600" cy="5200650"/>
+            <wp:effectExtent l="0" t="0" r="0" b="0"/>
+            <wp:docPr id="744208695" name="Picture 1"/>
+            <wp:cNvGraphicFramePr>
+              <a:graphicFrameLocks xmlns:a="http://schemas.openxmlformats.org/drawingml/2006/main" noChangeAspect="1"/>
+            </wp:cNvGraphicFramePr>
+            <a:graphic xmlns:a="http://schemas.openxmlformats.org/drawingml/2006/main">
+              <a:graphicData uri="http://schemas.openxmlformats.org/drawingml/2006/picture">
+                <pic:pic xmlns:pic="http://schemas.openxmlformats.org/drawingml/2006/picture">
+                  <pic:nvPicPr>
+                    <pic:cNvPr id="744208695" name=""/>
+                    <pic:cNvPicPr/>
+                  </pic:nvPicPr>
+                  <pic:blipFill>
+                    <a:blip r:embed="rId19"/>
+                    <a:stretch>
+                      <a:fillRect/>
+                    </a:stretch>
+                  </pic:blipFill>
+                  <pic:spPr>
+                    <a:xfrm>
+                      <a:off x="0" y="0"/>
+                      <a:ext cx="5943600" cy="5200650"/>
+                    </a:xfrm>
+                    <a:prstGeom prst="rect">
+                      <a:avLst/>
+                    </a:prstGeom>
+                  </pic:spPr>
+                </pic:pic>
+              </a:graphicData>
+            </a:graphic>
+          </wp:inline>
+        </w:drawing>
+      </w:r>
+    </w:p>
+    <w:p>
+      <w:pPr>
+        <w:pBdr>
+          <w:bottom w:val="single" w:sz="6" w:space="1" w:color="auto"/>
+        </w:pBdr>
+        <w:rPr>
+          <w:color w:val="EE0000"/>
+          <w:sz w:val="36"/>
+          <w:szCs w:val="36"/>
+        </w:rPr>
+      </w:pPr>
+    </w:p>
+    <w:p>
+      <w:pPr>
+        <w:pBdr>
+          <w:bottom w:val="single" w:sz="6" w:space="1" w:color="auto"/>
+        </w:pBdr>
+        <w:rPr>
+          <w:color w:val="EE0000"/>
+          <w:sz w:val="36"/>
+          <w:szCs w:val="36"/>
+        </w:rPr>
+      </w:pPr>
+    </w:p>
+    <w:p>
+      <w:pPr>
+        <w:pBdr>
+          <w:bottom w:val="single" w:sz="6" w:space="1" w:color="auto"/>
+        </w:pBdr>
+        <w:rPr>
+          <w:color w:val="EE0000"/>
+          <w:sz w:val="36"/>
+          <w:szCs w:val="36"/>
+        </w:rPr>
+      </w:pPr>
+    </w:p>
+    <w:p>
+      <w:pPr>
+        <w:pBdr>
+          <w:bottom w:val="single" w:sz="6" w:space="1" w:color="auto"/>
+        </w:pBdr>
+      </w:pPr>
+    </w:p>
+    <w:p>
+      <w:pPr>
+        <w:pBdr>
+          <w:bottom w:val="single" w:sz="6" w:space="1" w:color="auto"/>
+        </w:pBdr>
+      </w:pPr>
+    </w:p>
+    <w:p>
+      <w:pPr>
+        <w:pBdr>
+          <w:bottom w:val="single" w:sz="6" w:space="1" w:color="auto"/>
+        </w:pBdr>
+      </w:pPr>
+    </w:p>
+    <w:p>
+      <w:pPr>
+        <w:pBdr>
+          <w:bottom w:val="single" w:sz="6" w:space="1" w:color="auto"/>
+        </w:pBdr>
+      </w:pPr>
+    </w:p>
+    <w:p>
+      <w:pPr>
+        <w:pBdr>
+          <w:bottom w:val="single" w:sz="6" w:space="1" w:color="auto"/>
+        </w:pBdr>
+      </w:pPr>
+      <w:r>
+        <w:t>1</w:t>
+      </w:r>
+      <w:r>
+        <w:t>2</w:t>
+      </w:r>
+      <w:r>
+        <w:t xml:space="preserve">) </w:t>
+      </w:r>
+      <w:r>
+        <w:t>Avg Death Case out of 1 M Population</w:t>
+      </w:r>
+    </w:p>
+    <w:p>
+      <w:pPr>
+        <w:pBdr>
+          <w:bottom w:val="single" w:sz="6" w:space="1" w:color="auto"/>
+        </w:pBdr>
+      </w:pPr>
+      <w:r>
+        <w:drawing>
+          <wp:inline distT="0" distB="0" distL="0" distR="0" wp14:anchorId="5499D17E" wp14:editId="1980987F">
+            <wp:extent cx="5943600" cy="5353050"/>
+            <wp:effectExtent l="0" t="0" r="0" b="0"/>
+            <wp:docPr id="1958333700" name="Picture 1"/>
+            <wp:cNvGraphicFramePr>
+              <a:graphicFrameLocks xmlns:a="http://schemas.openxmlformats.org/drawingml/2006/main" noChangeAspect="1"/>
+            </wp:cNvGraphicFramePr>
+            <a:graphic xmlns:a="http://schemas.openxmlformats.org/drawingml/2006/main">
+              <a:graphicData uri="http://schemas.openxmlformats.org/drawingml/2006/picture">
+                <pic:pic xmlns:pic="http://schemas.openxmlformats.org/drawingml/2006/picture">
+                  <pic:nvPicPr>
+                    <pic:cNvPr id="1958333700" name=""/>
+                    <pic:cNvPicPr/>
+                  </pic:nvPicPr>
+                  <pic:blipFill>
+                    <a:blip r:embed="rId20"/>
+                    <a:stretch>
+                      <a:fillRect/>
+                    </a:stretch>
+                  </pic:blipFill>
+                  <pic:spPr>
+                    <a:xfrm>
+                      <a:off x="0" y="0"/>
+                      <a:ext cx="5943600" cy="5353050"/>
+                    </a:xfrm>
+                    <a:prstGeom prst="rect">
+                      <a:avLst/>
+                    </a:prstGeom>
+                  </pic:spPr>
+                </pic:pic>
+              </a:graphicData>
+            </a:graphic>
+          </wp:inline>
+        </w:drawing>
+      </w:r>
+    </w:p>
+    <w:p>
+      <w:pPr>
+        <w:pBdr>
+          <w:bottom w:val="single" w:sz="6" w:space="1" w:color="auto"/>
+        </w:pBdr>
+        <w:rPr>
+          <w:color w:val="EE0000"/>
+          <w:sz w:val="36"/>
+          <w:szCs w:val="36"/>
+        </w:rPr>
+      </w:pPr>
+    </w:p>
+    <w:p>
+      <w:pPr>
+        <w:pBdr>
+          <w:bottom w:val="single" w:sz="6" w:space="1" w:color="auto"/>
+        </w:pBdr>
+        <w:rPr>
+          <w:color w:val="EE0000"/>
+          <w:sz w:val="36"/>
+          <w:szCs w:val="36"/>
+        </w:rPr>
+      </w:pPr>
+    </w:p>
+    <w:p>
+      <w:pPr>
+        <w:pBdr>
+          <w:bottom w:val="single" w:sz="6" w:space="1" w:color="auto"/>
+        </w:pBdr>
+        <w:rPr>
+          <w:color w:val="EE0000"/>
+          <w:sz w:val="36"/>
+          <w:szCs w:val="36"/>
+        </w:rPr>
+      </w:pPr>
+    </w:p>
+    <w:p>
+      <w:pPr>
+        <w:pBdr>
+          <w:bottom w:val="single" w:sz="6" w:space="1" w:color="auto"/>
+        </w:pBdr>
+        <w:rPr>
+          <w:color w:val="EE0000"/>
+          <w:sz w:val="36"/>
+          <w:szCs w:val="36"/>
+        </w:rPr>
+      </w:pPr>
+    </w:p>
+    <w:p>
+      <w:pPr>
+        <w:pBdr>
+          <w:bottom w:val="single" w:sz="6" w:space="1" w:color="auto"/>
+        </w:pBdr>
+        <w:rPr>
+          <w:color w:val="EE0000"/>
+          <w:sz w:val="36"/>
+          <w:szCs w:val="36"/>
+        </w:rPr>
+      </w:pPr>
+    </w:p>
+    <w:p>
+      <w:pPr>
+        <w:pBdr>
+          <w:bottom w:val="single" w:sz="6" w:space="1" w:color="auto"/>
+        </w:pBdr>
+        <w:rPr>
+          <w:color w:val="EE0000"/>
+          <w:sz w:val="36"/>
+          <w:szCs w:val="36"/>
+        </w:rPr>
+      </w:pPr>
+    </w:p>
+    <w:p>
+      <w:pPr>
+        <w:pBdr>
+          <w:bottom w:val="single" w:sz="6" w:space="1" w:color="auto"/>
+        </w:pBdr>
+        <w:rPr>
+          <w:color w:val="EE0000"/>
+          <w:sz w:val="36"/>
+          <w:szCs w:val="36"/>
+        </w:rPr>
+      </w:pPr>
+      <w:r>
+        <w:rPr>
+          <w:color w:val="EE0000"/>
+          <w:sz w:val="36"/>
+          <w:szCs w:val="36"/>
+        </w:rPr>
+        <w:t>Dashboard</w:t>
+      </w:r>
+    </w:p>
+    <w:p>
+      <w:pPr>
+        <w:pBdr>
+          <w:bottom w:val="single" w:sz="6" w:space="1" w:color="auto"/>
+        </w:pBdr>
+        <w:rPr>
+          <w:color w:val="EE0000"/>
+          <w:sz w:val="36"/>
+          <w:szCs w:val="36"/>
+        </w:rPr>
+      </w:pPr>
+    </w:p>
+    <w:p/>
+    <w:p>
+      <w:r>
+        <w:drawing>
+          <wp:inline distT="0" distB="0" distL="0" distR="0" wp14:anchorId="428C7578" wp14:editId="7A4B5611">
+            <wp:extent cx="5943600" cy="5646420"/>
+            <wp:effectExtent l="0" t="0" r="0" b="0"/>
+            <wp:docPr id="1379075031" name="Picture 1"/>
+            <wp:cNvGraphicFramePr>
+              <a:graphicFrameLocks xmlns:a="http://schemas.openxmlformats.org/drawingml/2006/main" noChangeAspect="1"/>
+            </wp:cNvGraphicFramePr>
+            <a:graphic xmlns:a="http://schemas.openxmlformats.org/drawingml/2006/main">
+              <a:graphicData uri="http://schemas.openxmlformats.org/drawingml/2006/picture">
+                <pic:pic xmlns:pic="http://schemas.openxmlformats.org/drawingml/2006/picture">
+                  <pic:nvPicPr>
+                    <pic:cNvPr id="1379075031" name=""/>
+                    <pic:cNvPicPr/>
+                  </pic:nvPicPr>
+                  <pic:blipFill>
+                    <a:blip r:embed="rId21"/>
+                    <a:stretch>
+                      <a:fillRect/>
+                    </a:stretch>
+                  </pic:blipFill>
+                  <pic:spPr>
+                    <a:xfrm>
+                      <a:off x="0" y="0"/>
+                      <a:ext cx="5943600" cy="5646420"/>
+                    </a:xfrm>
+                    <a:prstGeom prst="rect">
+                      <a:avLst/>
+                    </a:prstGeom>
+                  </pic:spPr>
+                </pic:pic>
+              </a:graphicData>
+            </a:graphic>
+          </wp:inline>
+        </w:drawing>
+      </w:r>
+    </w:p>
     <w:p>
       <w:pPr>
         <w:jc w:val="center"/>
@@ -1167,8 +1531,8 @@
       </w:r>
     </w:p>
     <w:sectPr>
-      <w:headerReference w:type="default" r:id="rId18"/>
-      <w:footerReference w:type="default" r:id="rId19"/>
+      <w:headerReference w:type="default" r:id="rId22"/>
+      <w:footerReference w:type="default" r:id="rId23"/>
       <w:pgSz w:w="12240" w:h="15840"/>
       <w:pgMar w:top="1440" w:right="1440" w:bottom="1440" w:left="1440" w:header="720" w:footer="720" w:gutter="0"/>
       <w:cols w:space="720"/>
@@ -2710,6 +3074,29 @@
     <w:uiPriority w:val="99"/>
     <w:rsid w:val="00882C68"/>
   </w:style>
+  <w:style w:type="character" w:styleId="Hyperlink">
+    <w:name w:val="Hyperlink"/>
+    <w:basedOn w:val="DefaultParagraphFont"/>
+    <w:uiPriority w:val="99"/>
+    <w:unhideWhenUsed/>
+    <w:rsid w:val="002413EB"/>
+    <w:rPr>
+      <w:color w:val="0563C1" w:themeColor="hyperlink"/>
+      <w:u w:val="single"/>
+    </w:rPr>
+  </w:style>
+  <w:style w:type="character" w:styleId="UnresolvedMention">
+    <w:name w:val="Unresolved Mention"/>
+    <w:basedOn w:val="DefaultParagraphFont"/>
+    <w:uiPriority w:val="99"/>
+    <w:semiHidden/>
+    <w:unhideWhenUsed/>
+    <w:rsid w:val="002413EB"/>
+    <w:rPr>
+      <w:color w:val="605E5C"/>
+      <w:shd w:val="clear" w:color="auto" w:fill="E1DFDD"/>
+    </w:rPr>
+  </w:style>
 </w:styles>
 </file>
 

</xml_diff>